<commit_message>
Rewrite or edit a blocked cover letter from History; cleaner letter layout
- History: when the check stops a render, a box under the problems lets the
  writer rewrite only the letter to fix them, plus your own instructions. The
  CV stays as it is; the result is checked again and saved as a new draft.
- History: the newest letter is editable in place ("Save my edits"), and
  "Open in the editor" jumps to the Apply page.
- generate: rewrite_letter(), sharing the prompt and check/fix loop with
  draft_application. CV errors aren't sent to the writer when the CV is fixed.
- Cover letter template: the CV's header (name, contact line, rule),
  left-aligned 12 pt text instead of justified, room for the signature. The
  HTML preview matches.

Co-Authored-By: Claude Opus 5.5 <noreply@anthropic.com>
</commit_message>
<xml_diff>
--- a/templates/cl_template.docx
+++ b/templates/cl_template.docx
@@ -5,92 +5,141 @@
     <w:p>
       <w:pPr>
         <w:jc w:val="center"/>
-        <w:pBdr>
-          <w:bottom w:val="single" w:sz="6" w:space="1" w:color="000000"/>
-        </w:pBdr>
+        <w:spacing w:before="0" w:after="20"/>
       </w:pPr>
       <w:r>
         <w:rPr>
           <w:b/>
           <w:i w:val="0"/>
-          <w:sz w:val="32"/>
+          <w:sz w:val="34"/>
         </w:rPr>
-        <w:t>{{ personal.name|upper }}</w:t>
-      </w:r>
-    </w:p>
-    <w:p/>
-    <w:p>
-      <w:r>
-        <w:t>{{ date }}</w:t>
-      </w:r>
-    </w:p>
-    <w:p/>
-    <w:p>
-      <w:r>
-        <w:t>{%p for line in recipient_lines %}</w:t>
-      </w:r>
-    </w:p>
-    <w:p>
-      <w:r>
-        <w:t>{{ line }}</w:t>
-      </w:r>
-    </w:p>
-    <w:p>
-      <w:r>
-        <w:t>{%p endfor %}</w:t>
-      </w:r>
-    </w:p>
-    <w:p/>
-    <w:p>
-      <w:pPr>
-        <w:spacing w:after="160"/>
-      </w:pPr>
-      <w:r>
-        <w:t>{{ salutation }}</w:t>
-      </w:r>
-    </w:p>
-    <w:p>
-      <w:r>
-        <w:t>{%p for para in paragraphs %}</w:t>
+        <w:t xml:space="preserve">{{ personal.name|upper }}</w:t>
       </w:r>
     </w:p>
     <w:p>
       <w:pPr>
-        <w:spacing w:after="160"/>
-        <w:jc w:val="both"/>
+        <w:pBdr>
+          <w:bottom w:val="single" w:sz="6" w:space="4" w:color="000000"/>
+        </w:pBdr>
+        <w:jc w:val="center"/>
+        <w:spacing w:before="0" w:after="480"/>
       </w:pPr>
       <w:r>
-        <w:t>{{ para }}</w:t>
+        <w:rPr>
+          <w:b w:val="0"/>
+          <w:i/>
+          <w:sz w:val="19"/>
+        </w:rPr>
+        <w:t xml:space="preserve">{{ personal.contact_line }}</w:t>
       </w:r>
     </w:p>
     <w:p>
+      <w:pPr>
+        <w:spacing w:before="0" w:after="240"/>
+      </w:pPr>
       <w:r>
-        <w:t>{%p endfor %}</w:t>
+        <w:rPr>
+          <w:sz w:val="24"/>
+        </w:rPr>
+        <w:t xml:space="preserve">{{ date }}</w:t>
       </w:r>
     </w:p>
     <w:p>
+      <w:pPr/>
       <w:r>
-        <w:t>{{ closing }}</w:t>
+        <w:rPr>
+          <w:sz w:val="24"/>
+        </w:rPr>
+        <w:t xml:space="preserve">{%p for line in recipient_lines %}</w:t>
       </w:r>
     </w:p>
     <w:p>
+      <w:pPr>
+        <w:spacing w:before="0" w:after="0"/>
+      </w:pPr>
       <w:r>
-        <w:t>{{ personal.name }}</w:t>
+        <w:rPr>
+          <w:sz w:val="24"/>
+        </w:rPr>
+        <w:t xml:space="preserve">{{ line }}</w:t>
       </w:r>
     </w:p>
     <w:p>
+      <w:pPr/>
       <w:r>
         <w:rPr>
-          <w:b w:val="0"/>
-          <w:i w:val="0"/>
-          <w:sz w:val="20"/>
+          <w:sz w:val="24"/>
         </w:rPr>
-        <w:t>{{ personal.phone }} | {{ personal.email }} | {{ personal.github }}</w:t>
+        <w:t xml:space="preserve">{%p endfor %}</w:t>
+      </w:r>
+    </w:p>
+    <w:p>
+      <w:pPr>
+        <w:spacing w:before="240" w:after="200"/>
+      </w:pPr>
+      <w:r>
+        <w:rPr>
+          <w:sz w:val="24"/>
+        </w:rPr>
+        <w:t xml:space="preserve">{{ salutation }}</w:t>
+      </w:r>
+    </w:p>
+    <w:p>
+      <w:pPr/>
+      <w:r>
+        <w:rPr>
+          <w:sz w:val="24"/>
+        </w:rPr>
+        <w:t xml:space="preserve">{%p for para in paragraphs %}</w:t>
+      </w:r>
+    </w:p>
+    <w:p>
+      <w:pPr>
+        <w:jc w:val="left"/>
+        <w:spacing w:before="0" w:after="200" w:line="264" w:lineRule="auto"/>
+      </w:pPr>
+      <w:r>
+        <w:rPr>
+          <w:sz w:val="24"/>
+        </w:rPr>
+        <w:t xml:space="preserve">{{ para }}</w:t>
+      </w:r>
+    </w:p>
+    <w:p>
+      <w:pPr/>
+      <w:r>
+        <w:rPr>
+          <w:sz w:val="24"/>
+        </w:rPr>
+        <w:t xml:space="preserve">{%p endfor %}</w:t>
+      </w:r>
+    </w:p>
+    <w:p>
+      <w:pPr>
+        <w:keepNext/>
+        <w:spacing w:before="80" w:after="560"/>
+      </w:pPr>
+      <w:r>
+        <w:rPr>
+          <w:sz w:val="24"/>
+        </w:rPr>
+        <w:t xml:space="preserve">{{ closing }}</w:t>
+      </w:r>
+    </w:p>
+    <w:p>
+      <w:pPr>
+        <w:spacing w:before="0" w:after="0"/>
+      </w:pPr>
+      <w:r>
+        <w:rPr>
+          <w:sz w:val="24"/>
+        </w:rPr>
+        <w:t xml:space="preserve">{{ personal.name }}</w:t>
       </w:r>
     </w:p>
     <w:sectPr>
       <w:pgSz w:w="12240" w:h="15840"/>
-      <w:pgMar w:top="1440" w:right="1440" w:bottom="1440" w:left="1440" w:header="720" w:footer="720" w:gutter="0"/>
+      <w:pgMar w:top="1080" w:right="1440" w:bottom="1080" w:left="1440" w:header="720" w:footer="720" w:gutter="0"/>
       <w:cols w:space="720"/>
       <w:docGrid w:linePitch="360"/>
     </w:sectPr>

</xml_diff>